<commit_message>
Correct anchoring framing: ALL THREE models anchor, differing in strength
Revised reading of the modal data: Gemini and Llama also show round-number locking (modal
plateaus stepping 25->30->35/40), not smooth tracking as first written. All three produce
staircases; they differ in strength (Grok: 11-count capture zone on 25, 55% of answers round;
Gemini/Llama: ~4-count plateaus, bulk near chance but mode still locks). Added quantitative
capture-width + modal-on-x5 + share-on-x5 metrics. Updated paper, both READMEs, the 3-model
figure title, and regenerated the .docx. Tightened the methodology section.

🤖 Generated with [Claude Code](https://claude.com/claude-code)
</commit_message>
<xml_diff>
--- a/number-sense/Number_Sense_in_Vision_LLMs.docx
+++ b/number-sense/Number_Sense_in_Vision_LLMs.docx
@@ -2,13 +2,13 @@
 <file path=word/document.xml><?xml version="1.0" encoding="utf-8"?>
 <w:document xmlns:w="http://schemas.openxmlformats.org/wordprocessingml/2006/main" xmlns:m="http://schemas.openxmlformats.org/officeDocument/2006/math" xmlns:r="http://schemas.openxmlformats.org/officeDocument/2006/relationships" xmlns:o="urn:schemas-microsoft-com:office:office" xmlns:v="urn:schemas-microsoft-com:vml" xmlns:w10="urn:schemas-microsoft-com:office:word" xmlns:a="http://schemas.openxmlformats.org/drawingml/2006/main" xmlns:pic="http://schemas.openxmlformats.org/drawingml/2006/picture" xmlns:wp="http://schemas.openxmlformats.org/drawingml/2006/wordprocessingDrawing">
   <w:body>
-    <w:bookmarkStart w:id="24" w:name="X0cd6cefd876df4494eb954346ff63219fd097b1"/>
+    <w:bookmarkStart w:id="24" w:name="X71c028cfabb76556499596bec1f46a00c97f3df"/>
     <w:p>
       <w:pPr>
         <w:pStyle w:val="Heading1"/>
       </w:pPr>
       <w:r>
-        <w:t xml:space="preserve">Number Sense in Vision-Language Models: Subitizing, Weberian Estimation, and Model-Specific Round-Number Anchoring</w:t>
+        <w:t xml:space="preserve">Number Sense in Vision-Language Models: Subitizing, Weberian Estimation, and Round-Number Anchoring</w:t>
       </w:r>
     </w:p>
     <w:p>
@@ -100,13 +100,13 @@
         <w:t xml:space="preserve"> </w:t>
       </w:r>
       <w:r>
-        <w:t xml:space="preserve">judged (Weber’s law). The fine structure, however, is model-specific. Only one model (Grok)</w:t>
-      </w:r>
-      <w:r>
-        <w:t xml:space="preserve"> </w:t>
-      </w:r>
-      <w:r>
-        <w:t xml:space="preserve">subitizes perfectly; estimation precision tracks model capability; and most strikingly,</w:t>
+        <w:t xml:space="preserve">judged (Weber’s law). The fine structure varies by model. Only one model (Grok) subitizes</w:t>
+      </w:r>
+      <w:r>
+        <w:t xml:space="preserve"> </w:t>
+      </w:r>
+      <w:r>
+        <w:t xml:space="preserve">perfectly; estimation precision tracks model capability; and</w:t>
       </w:r>
       <w:r>
         <w:t xml:space="preserve"> </w:t>
@@ -122,25 +122,47 @@
         <w:t xml:space="preserve"> </w:t>
       </w:r>
       <w:r>
-        <w:t xml:space="preserve">— a documented human estimation strategy in which responses cluster on</w:t>
-      </w:r>
-      <w:r>
-        <w:t xml:space="preserve"> </w:t>
-      </w:r>
-      <w:r>
-        <w:t xml:space="preserve">multiples of five — appears strongly in Grok and is essentially absent in Gemini and Llama. We</w:t>
-      </w:r>
-      <w:r>
-        <w:t xml:space="preserve"> </w:t>
-      </w:r>
-      <w:r>
-        <w:t xml:space="preserve">demonstrate the anchoring result with a dedicated test covering every integer from 25 to 40, where</w:t>
-      </w:r>
-      <w:r>
-        <w:t xml:space="preserve"> </w:t>
-      </w:r>
-      <w:r>
-        <w:t xml:space="preserve">Grok’s single most-common answer remains locked on</w:t>
+        <w:t xml:space="preserve">— a</w:t>
+      </w:r>
+      <w:r>
+        <w:t xml:space="preserve"> </w:t>
+      </w:r>
+      <w:r>
+        <w:t xml:space="preserve">documented human estimation strategy in which responses cluster on multiples of five — appears in</w:t>
+      </w:r>
+      <w:r>
+        <w:t xml:space="preserve"> </w:t>
+      </w:r>
+      <w:r>
+        <w:rPr>
+          <w:b/>
+          <w:bCs/>
+        </w:rPr>
+        <w:t xml:space="preserve">all three</w:t>
+      </w:r>
+      <w:r>
+        <w:t xml:space="preserve"> </w:t>
+      </w:r>
+      <w:r>
+        <w:t xml:space="preserve">models, varying markedly in strength. We demonstrate this with a dedicated test</w:t>
+      </w:r>
+      <w:r>
+        <w:t xml:space="preserve"> </w:t>
+      </w:r>
+      <w:r>
+        <w:t xml:space="preserve">covering every integer from 25 to 40: each model’s most-common answer locks onto preferred values</w:t>
+      </w:r>
+      <w:r>
+        <w:t xml:space="preserve"> </w:t>
+      </w:r>
+      <w:r>
+        <w:t xml:space="preserve">and holds them across runs of consecutive true counts (a staircase), Grok most extremely (its mode</w:t>
+      </w:r>
+      <w:r>
+        <w:t xml:space="preserve"> </w:t>
+      </w:r>
+      <w:r>
+        <w:t xml:space="preserve">remains</w:t>
       </w:r>
       <w:r>
         <w:t xml:space="preserve"> </w:t>
@@ -152,25 +174,31 @@
         <w:t xml:space="preserve"> </w:t>
       </w:r>
       <w:r>
-        <w:t xml:space="preserve">across true counts from 25 through 35</w:t>
-      </w:r>
-      <w:r>
-        <w:t xml:space="preserve"> </w:t>
-      </w:r>
-      <w:r>
-        <w:t xml:space="preserve">before stepping discretely upward. We conclude that the analog magnitude system (subitizing plus</w:t>
-      </w:r>
-      <w:r>
-        <w:t xml:space="preserve"> </w:t>
-      </w:r>
-      <w:r>
-        <w:t xml:space="preserve">magnitude-scaled error) is architecture-general, while its precision and the human-like</w:t>
-      </w:r>
-      <w:r>
-        <w:t xml:space="preserve"> </w:t>
-      </w:r>
-      <w:r>
-        <w:t xml:space="preserve">decision-strategy overlay that sits on top of it are model-specific. All raw model responses are</w:t>
+        <w:t xml:space="preserve">across true counts 25 through 35), Gemini and Llama more mildly (modal plateaus of</w:t>
+      </w:r>
+      <w:r>
+        <w:t xml:space="preserve"> </w:t>
+      </w:r>
+      <w:r>
+        <w:t xml:space="preserve">about four counts on values such as 26, 30, and 40). We conclude that the analog magnitude system</w:t>
+      </w:r>
+      <w:r>
+        <w:t xml:space="preserve"> </w:t>
+      </w:r>
+      <w:r>
+        <w:t xml:space="preserve">(subitizing plus magnitude-scaled error) is architecture-general, and that the human-like</w:t>
+      </w:r>
+      <w:r>
+        <w:t xml:space="preserve"> </w:t>
+      </w:r>
+      <w:r>
+        <w:t xml:space="preserve">round-number-anchoring strategy is architecture-general in kind while differing in degree across</w:t>
+      </w:r>
+      <w:r>
+        <w:t xml:space="preserve"> </w:t>
+      </w:r>
+      <w:r>
+        <w:t xml:space="preserve">models; estimation precision, in turn, tracks model capability. All raw model responses are</w:t>
       </w:r>
       <w:r>
         <w:t xml:space="preserve"> </w:t>
@@ -1023,7 +1051,7 @@
         <w:t xml:space="preserve"> </w:t>
       </w:r>
       <w:r>
-        <w:t xml:space="preserve">and (in Grok) is distorted by round-number clustering (§4).</w:t>
+        <w:t xml:space="preserve">and is distorted by the round-number clustering documented in §4.</w:t>
       </w:r>
     </w:p>
     <w:p>
@@ -1119,13 +1147,13 @@
       </w:r>
     </w:p>
     <w:bookmarkEnd w:id="12"/>
-    <w:bookmarkStart w:id="19" w:name="Xff1f3560e215eb2b95cf8ecb71eae83616ab77e"/>
+    <w:bookmarkStart w:id="19" w:name="Xc37191cda173eb37112a398e053bc8a089b47f4"/>
     <w:p>
       <w:pPr>
         <w:pStyle w:val="Heading2"/>
       </w:pPr>
       <w:r>
-        <w:t xml:space="preserve">4. Results: round-number anchoring is model-specific</w:t>
+        <w:t xml:space="preserve">4. Results: round-number anchoring is general, and varies in strength</w:t>
       </w:r>
     </w:p>
     <w:p>
@@ -1214,13 +1242,13 @@
         <w:t xml:space="preserve"> </w:t>
       </w:r>
       <w:r>
-        <w:t xml:space="preserve">on a round value as the true count</w:t>
-      </w:r>
-      <w:r>
-        <w:t xml:space="preserve"> </w:t>
-      </w:r>
-      <w:r>
-        <w:t xml:space="preserve">changes, producing a flat</w:t>
+        <w:t xml:space="preserve">on a value across a run of consecutive</w:t>
+      </w:r>
+      <w:r>
+        <w:t xml:space="preserve"> </w:t>
+      </w:r>
+      <w:r>
+        <w:t xml:space="preserve">true counts, producing a</w:t>
       </w:r>
       <w:r>
         <w:t xml:space="preserve"> </w:t>
@@ -1236,62 +1264,19 @@
         <w:t xml:space="preserve"> </w:t>
       </w:r>
       <w:r>
-        <w:t xml:space="preserve">when modal response is plotted against true count. If a model</w:t>
-      </w:r>
-      <w:r>
-        <w:t xml:space="preserve"> </w:t>
-      </w:r>
-      <w:r>
-        <w:t xml:space="preserve">estimates honestly, its modal response climbs with the true count, producing a</w:t>
-      </w:r>
-      <w:r>
-        <w:t xml:space="preserve"> </w:t>
-      </w:r>
-      <w:r>
-        <w:rPr>
-          <w:i/>
-          <w:iCs/>
-        </w:rPr>
-        <w:t xml:space="preserve">diagonal</w:t>
-      </w:r>
-      <w:r>
-        <w:t xml:space="preserve">. (We</w:t>
-      </w:r>
-      <w:r>
-        <w:t xml:space="preserve"> </w:t>
-      </w:r>
-      <w:r>
-        <w:t xml:space="preserve">avoid leaning on</w:t>
-      </w:r>
-      <w:r>
-        <w:t xml:space="preserve"> </w:t>
-      </w:r>
-      <w:r>
-        <w:t xml:space="preserve">“percent of answers that are multiples of five,”</w:t>
-      </w:r>
-      <w:r>
-        <w:t xml:space="preserve"> </w:t>
-      </w:r>
-      <w:r>
-        <w:t xml:space="preserve">because at a true count of 25 the</w:t>
-      </w:r>
-      <w:r>
-        <w:t xml:space="preserve"> </w:t>
-      </w:r>
-      <w:r>
-        <w:t xml:space="preserve">answer</w:t>
-      </w:r>
-      <w:r>
-        <w:t xml:space="preserve"> </w:t>
-      </w:r>
-      <w:r>
-        <w:t xml:space="preserve">“25”</w:t>
-      </w:r>
-      <w:r>
-        <w:t xml:space="preserve"> </w:t>
-      </w:r>
-      <w:r>
-        <w:t xml:space="preserve">is also simply correct; that metric conflates anchoring with accuracy.)</w:t>
+        <w:t xml:space="preserve">when modal response is plotted against true count: flat treads</w:t>
+      </w:r>
+      <w:r>
+        <w:t xml:space="preserve"> </w:t>
+      </w:r>
+      <w:r>
+        <w:t xml:space="preserve">on preferred values, with discrete steps between them. If a model estimated without any preferred</w:t>
+      </w:r>
+      <w:r>
+        <w:t xml:space="preserve"> </w:t>
+      </w:r>
+      <w:r>
+        <w:t xml:space="preserve">values, its modal response would climb smoothly with the true count (a diagonal).</w:t>
       </w:r>
     </w:p>
     <w:p>
@@ -1299,215 +1284,165 @@
         <w:pStyle w:val="BodyText"/>
       </w:pPr>
       <w:r>
-        <w:t xml:space="preserve">The three models dissociate sharply:</w:t>
-      </w:r>
-    </w:p>
-    <w:tbl>
-      <w:tblPr>
-        <w:tblStyle w:val="Table"/>
-        <w:tblW w:type="pct" w:w="5000"/>
-        <w:tblLayout w:type="fixed"/>
-        <w:tblLook w:firstRow="1" w:lastRow="0" w:firstColumn="0" w:lastColumn="0" w:noHBand="0" w:noVBand="0" w:val="0020"/>
-      </w:tblPr>
-      <w:tblGrid>
-        <w:gridCol w:w="2640"/>
-        <w:gridCol w:w="2640"/>
-        <w:gridCol w:w="2640"/>
-      </w:tblGrid>
-      <w:tr>
-        <w:trPr>
-          <w:tblHeader w:val="on"/>
-        </w:trPr>
-        <w:tc>
-          <w:tcPr/>
-          <w:p>
-            <w:pPr>
-              <w:pStyle w:val="Compact"/>
-            </w:pPr>
-            <w:r>
-              <w:t xml:space="preserve">Model</w:t>
-            </w:r>
-          </w:p>
-        </w:tc>
-        <w:tc>
-          <w:tcPr/>
-          <w:p>
-            <w:pPr>
-              <w:pStyle w:val="Compact"/>
-            </w:pPr>
-            <w:r>
-              <w:t xml:space="preserve">Anchors?</w:t>
-            </w:r>
-          </w:p>
-        </w:tc>
-        <w:tc>
-          <w:tcPr/>
-          <w:p>
-            <w:pPr>
-              <w:pStyle w:val="Compact"/>
-            </w:pPr>
-            <w:r>
-              <w:t xml:space="preserve">Modal response, true counts 25 → 40</w:t>
-            </w:r>
-          </w:p>
-        </w:tc>
-      </w:tr>
-      <w:tr>
-        <w:tc>
-          <w:tcPr/>
-          <w:p>
-            <w:pPr>
-              <w:pStyle w:val="Compact"/>
-            </w:pPr>
-            <w:r>
-              <w:rPr>
-                <w:b/>
-                <w:bCs/>
-              </w:rPr>
-              <w:t xml:space="preserve">Grok</w:t>
-            </w:r>
-            <w:r>
-              <w:t xml:space="preserve"> </w:t>
-            </w:r>
-            <w:r>
-              <w:t xml:space="preserve">(xAI)</w:t>
-            </w:r>
-          </w:p>
-        </w:tc>
-        <w:tc>
-          <w:tcPr/>
-          <w:p>
-            <w:pPr>
-              <w:pStyle w:val="Compact"/>
-            </w:pPr>
-            <w:r>
-              <w:rPr>
-                <w:b/>
-                <w:bCs/>
-              </w:rPr>
-              <w:t xml:space="preserve">Yes, strongly</w:t>
-            </w:r>
-          </w:p>
-        </w:tc>
-        <w:tc>
-          <w:tcPr/>
-          <w:p>
-            <w:pPr>
-              <w:pStyle w:val="Compact"/>
-            </w:pPr>
-            <w:r>
-              <w:t xml:space="preserve">locked on</w:t>
-            </w:r>
-            <w:r>
-              <w:t xml:space="preserve"> </w:t>
-            </w:r>
-            <w:r>
-              <w:rPr>
-                <w:b/>
-                <w:bCs/>
-              </w:rPr>
-              <w:t xml:space="preserve">25</w:t>
-            </w:r>
-            <w:r>
-              <w:t xml:space="preserve"> </w:t>
-            </w:r>
-            <w:r>
-              <w:t xml:space="preserve">from true 25 through 35, then steps to 32, then 40 — a staircase</w:t>
-            </w:r>
-          </w:p>
-        </w:tc>
-      </w:tr>
-      <w:tr>
-        <w:tc>
-          <w:tcPr/>
-          <w:p>
-            <w:pPr>
-              <w:pStyle w:val="Compact"/>
-            </w:pPr>
-            <w:r>
-              <w:rPr>
-                <w:b/>
-                <w:bCs/>
-              </w:rPr>
-              <w:t xml:space="preserve">Gemini</w:t>
-            </w:r>
-            <w:r>
-              <w:t xml:space="preserve"> </w:t>
-            </w:r>
-            <w:r>
-              <w:t xml:space="preserve">(Google)</w:t>
-            </w:r>
-          </w:p>
-        </w:tc>
-        <w:tc>
-          <w:tcPr/>
-          <w:p>
-            <w:pPr>
-              <w:pStyle w:val="Compact"/>
-            </w:pPr>
-            <w:r>
-              <w:t xml:space="preserve">No</w:t>
-            </w:r>
-          </w:p>
-        </w:tc>
-        <w:tc>
-          <w:tcPr/>
-          <w:p>
-            <w:pPr>
-              <w:pStyle w:val="Compact"/>
-            </w:pPr>
-            <w:r>
-              <w:t xml:space="preserve">climbs with the true count — a diagonal</w:t>
-            </w:r>
-          </w:p>
-        </w:tc>
-      </w:tr>
-      <w:tr>
-        <w:tc>
-          <w:tcPr/>
-          <w:p>
-            <w:pPr>
-              <w:pStyle w:val="Compact"/>
-            </w:pPr>
-            <w:r>
-              <w:rPr>
-                <w:b/>
-                <w:bCs/>
-              </w:rPr>
-              <w:t xml:space="preserve">Llama</w:t>
-            </w:r>
-            <w:r>
-              <w:t xml:space="preserve"> </w:t>
-            </w:r>
-            <w:r>
-              <w:t xml:space="preserve">(Meta)</w:t>
-            </w:r>
-          </w:p>
-        </w:tc>
-        <w:tc>
-          <w:tcPr/>
-          <w:p>
-            <w:pPr>
-              <w:pStyle w:val="Compact"/>
-            </w:pPr>
-            <w:r>
-              <w:t xml:space="preserve">No</w:t>
-            </w:r>
-          </w:p>
-        </w:tc>
-        <w:tc>
-          <w:tcPr/>
-          <w:p>
-            <w:pPr>
-              <w:pStyle w:val="Compact"/>
-            </w:pPr>
-            <w:r>
-              <w:t xml:space="preserve">climbs with the true count (noisy; mild stickiness near 40) — a diagonal</w:t>
-            </w:r>
-          </w:p>
-        </w:tc>
-      </w:tr>
-    </w:tbl>
+        <w:rPr>
+          <w:b/>
+          <w:bCs/>
+        </w:rPr>
+        <w:t xml:space="preserve">All three models produce staircases, not diagonals.</w:t>
+      </w:r>
+      <w:r>
+        <w:t xml:space="preserve"> </w:t>
+      </w:r>
+      <w:r>
+        <w:t xml:space="preserve">Each one’s modal answer locks onto a value</w:t>
+      </w:r>
+      <w:r>
+        <w:t xml:space="preserve"> </w:t>
+      </w:r>
+      <w:r>
+        <w:t xml:space="preserve">and holds it across a run of true counts before stepping. Their modal sequences (true count 25 → 40):</w:t>
+      </w:r>
+    </w:p>
+    <w:p>
+      <w:pPr>
+        <w:pStyle w:val="Compact"/>
+        <w:numPr>
+          <w:ilvl w:val="0"/>
+          <w:numId w:val="1005"/>
+        </w:numPr>
+      </w:pPr>
+      <w:r>
+        <w:rPr>
+          <w:b/>
+          <w:bCs/>
+        </w:rPr>
+        <w:t xml:space="preserve">Grok:</w:t>
+      </w:r>
+      <w:r>
+        <w:t xml:space="preserve"> </w:t>
+      </w:r>
+      <w:r>
+        <w:t xml:space="preserve">25, 25, 25, 25, 25, 25, 25, 25, 25, 25, 25, 32, 32, 40, 40, 40</w:t>
+      </w:r>
+    </w:p>
+    <w:p>
+      <w:pPr>
+        <w:pStyle w:val="Compact"/>
+        <w:numPr>
+          <w:ilvl w:val="0"/>
+          <w:numId w:val="1005"/>
+        </w:numPr>
+      </w:pPr>
+      <w:r>
+        <w:rPr>
+          <w:b/>
+          <w:bCs/>
+        </w:rPr>
+        <w:t xml:space="preserve">Gemini:</w:t>
+      </w:r>
+      <w:r>
+        <w:t xml:space="preserve"> </w:t>
+      </w:r>
+      <w:r>
+        <w:t xml:space="preserve">25, 26, 26, 26, 26, 30, 30, 30, 30, 31, 30, 33, 35, 35, 36, 36</w:t>
+      </w:r>
+    </w:p>
+    <w:p>
+      <w:pPr>
+        <w:pStyle w:val="Compact"/>
+        <w:numPr>
+          <w:ilvl w:val="0"/>
+          <w:numId w:val="1005"/>
+        </w:numPr>
+      </w:pPr>
+      <w:r>
+        <w:rPr>
+          <w:b/>
+          <w:bCs/>
+        </w:rPr>
+        <w:t xml:space="preserve">Llama:</w:t>
+      </w:r>
+      <w:r>
+        <w:t xml:space="preserve"> </w:t>
+      </w:r>
+      <w:r>
+        <w:t xml:space="preserve">20, 25, 28, 23, 27, 30, 31, 30, 30, 33, 36, 39, 40, 40, 40, 40</w:t>
+      </w:r>
+    </w:p>
+    <w:p>
+      <w:pPr>
+        <w:pStyle w:val="FirstParagraph"/>
+      </w:pPr>
+      <w:r>
+        <w:t xml:space="preserve">Gemini’s mode holds at ~26 across true counts 26–29, then locks on</w:t>
+      </w:r>
+      <w:r>
+        <w:t xml:space="preserve"> </w:t>
+      </w:r>
+      <w:r>
+        <w:rPr>
+          <w:b/>
+          <w:bCs/>
+        </w:rPr>
+        <w:t xml:space="preserve">30</w:t>
+      </w:r>
+      <w:r>
+        <w:t xml:space="preserve"> </w:t>
+      </w:r>
+      <w:r>
+        <w:t xml:space="preserve">across 30–33, then climbs</w:t>
+      </w:r>
+      <w:r>
+        <w:t xml:space="preserve"> </w:t>
+      </w:r>
+      <w:r>
+        <w:t xml:space="preserve">in steps and reaches only 35–36 even when the true count is 40. Llama, noisier, bounces near 25 for</w:t>
+      </w:r>
+      <w:r>
+        <w:t xml:space="preserve"> </w:t>
+      </w:r>
+      <w:r>
+        <w:t xml:space="preserve">25–29, sticks near</w:t>
+      </w:r>
+      <w:r>
+        <w:t xml:space="preserve"> </w:t>
+      </w:r>
+      <w:r>
+        <w:rPr>
+          <w:b/>
+          <w:bCs/>
+        </w:rPr>
+        <w:t xml:space="preserve">30</w:t>
+      </w:r>
+      <w:r>
+        <w:t xml:space="preserve"> </w:t>
+      </w:r>
+      <w:r>
+        <w:t xml:space="preserve">for 30–33, then climbs and locks on</w:t>
+      </w:r>
+      <w:r>
+        <w:t xml:space="preserve"> </w:t>
+      </w:r>
+      <w:r>
+        <w:rPr>
+          <w:b/>
+          <w:bCs/>
+        </w:rPr>
+        <w:t xml:space="preserve">40</w:t>
+      </w:r>
+      <w:r>
+        <w:t xml:space="preserve"> </w:t>
+      </w:r>
+      <w:r>
+        <w:t xml:space="preserve">for the top four. Grok shows the</w:t>
+      </w:r>
+      <w:r>
+        <w:t xml:space="preserve"> </w:t>
+      </w:r>
+      <w:r>
+        <w:t xml:space="preserve">same behavior in extreme form.</w:t>
+      </w:r>
+    </w:p>
     <w:p>
       <w:pPr>
         <w:pStyle w:val="CaptionedFigure"/>
@@ -1568,28 +1503,313 @@
         <w:pStyle w:val="BodyText"/>
       </w:pPr>
       <w:r>
-        <w:t xml:space="preserve">Grok’s anchoring is dramatic: its single most likely answer does not move across an eleven-unit</w:t>
-      </w:r>
-      <w:r>
-        <w:t xml:space="preserve"> </w:t>
-      </w:r>
-      <w:r>
-        <w:t xml:space="preserve">range of true counts (25 through 35). The mean creeps upward over that range only because a</w:t>
-      </w:r>
-      <w:r>
-        <w:t xml:space="preserve"> </w:t>
-      </w:r>
-      <w:r>
-        <w:t xml:space="preserve">minority of non-</w:t>
-      </w:r>
-      <w:r>
-        <w:t xml:space="preserve">“25”</w:t>
-      </w:r>
-      <w:r>
-        <w:t xml:space="preserve"> </w:t>
-      </w:r>
-      <w:r>
-        <w:t xml:space="preserve">responses drags the average along; the</w:t>
+        <w:t xml:space="preserve">Three quantitative measures (true counts 25–40; for a non-anchoring estimator, chance gives a modal</w:t>
+      </w:r>
+      <w:r>
+        <w:t xml:space="preserve"> </w:t>
+      </w:r>
+      <w:r>
+        <w:t xml:space="preserve">multiple-of-five at ~4/16 and ~20% of all answers on a multiple of five):</w:t>
+      </w:r>
+    </w:p>
+    <w:tbl>
+      <w:tblPr>
+        <w:tblStyle w:val="Table"/>
+        <w:tblW w:type="pct" w:w="5000"/>
+        <w:tblLayout w:type="fixed"/>
+        <w:tblLook w:firstRow="1" w:lastRow="0" w:firstColumn="0" w:lastColumn="0" w:noHBand="0" w:noVBand="0" w:val="0020"/>
+      </w:tblPr>
+      <w:tblGrid>
+        <w:gridCol w:w="1980"/>
+        <w:gridCol w:w="1980"/>
+        <w:gridCol w:w="1980"/>
+        <w:gridCol w:w="1980"/>
+      </w:tblGrid>
+      <w:tr>
+        <w:trPr>
+          <w:tblHeader w:val="on"/>
+        </w:trPr>
+        <w:tc>
+          <w:tcPr/>
+          <w:p>
+            <w:pPr>
+              <w:pStyle w:val="Compact"/>
+            </w:pPr>
+            <w:r>
+              <w:t xml:space="preserve">Measure</w:t>
+            </w:r>
+          </w:p>
+        </w:tc>
+        <w:tc>
+          <w:tcPr/>
+          <w:p>
+            <w:pPr>
+              <w:pStyle w:val="Compact"/>
+            </w:pPr>
+            <w:r>
+              <w:t xml:space="preserve">Grok (xAI)</w:t>
+            </w:r>
+          </w:p>
+        </w:tc>
+        <w:tc>
+          <w:tcPr/>
+          <w:p>
+            <w:pPr>
+              <w:pStyle w:val="Compact"/>
+            </w:pPr>
+            <w:r>
+              <w:t xml:space="preserve">Gemini (Google)</w:t>
+            </w:r>
+          </w:p>
+        </w:tc>
+        <w:tc>
+          <w:tcPr/>
+          <w:p>
+            <w:pPr>
+              <w:pStyle w:val="Compact"/>
+            </w:pPr>
+            <w:r>
+              <w:t xml:space="preserve">Llama (Meta)</w:t>
+            </w:r>
+          </w:p>
+        </w:tc>
+      </w:tr>
+      <w:tr>
+        <w:tc>
+          <w:tcPr/>
+          <w:p>
+            <w:pPr>
+              <w:pStyle w:val="Compact"/>
+            </w:pPr>
+            <w:r>
+              <w:t xml:space="preserve">True counts whose</w:t>
+            </w:r>
+            <w:r>
+              <w:t xml:space="preserve"> </w:t>
+            </w:r>
+            <w:r>
+              <w:rPr>
+                <w:b/>
+                <w:bCs/>
+              </w:rPr>
+              <w:t xml:space="preserve">mode is a multiple of 5</w:t>
+            </w:r>
+          </w:p>
+        </w:tc>
+        <w:tc>
+          <w:tcPr/>
+          <w:p>
+            <w:pPr>
+              <w:pStyle w:val="Compact"/>
+            </w:pPr>
+            <w:r>
+              <w:rPr>
+                <w:b/>
+                <w:bCs/>
+              </w:rPr>
+              <w:t xml:space="preserve">14 / 16</w:t>
+            </w:r>
+          </w:p>
+        </w:tc>
+        <w:tc>
+          <w:tcPr/>
+          <w:p>
+            <w:pPr>
+              <w:pStyle w:val="Compact"/>
+            </w:pPr>
+            <w:r>
+              <w:t xml:space="preserve">8 / 16</w:t>
+            </w:r>
+          </w:p>
+        </w:tc>
+        <w:tc>
+          <w:tcPr/>
+          <w:p>
+            <w:pPr>
+              <w:pStyle w:val="Compact"/>
+            </w:pPr>
+            <w:r>
+              <w:t xml:space="preserve">9 / 16</w:t>
+            </w:r>
+          </w:p>
+        </w:tc>
+      </w:tr>
+      <w:tr>
+        <w:tc>
+          <w:tcPr/>
+          <w:p>
+            <w:pPr>
+              <w:pStyle w:val="Compact"/>
+            </w:pPr>
+            <w:r>
+              <w:t xml:space="preserve">Widest</w:t>
+            </w:r>
+            <w:r>
+              <w:t xml:space="preserve"> </w:t>
+            </w:r>
+            <w:r>
+              <w:rPr>
+                <w:b/>
+                <w:bCs/>
+              </w:rPr>
+              <w:t xml:space="preserve">capture zone</w:t>
+            </w:r>
+            <w:r>
+              <w:t xml:space="preserve"> </w:t>
+            </w:r>
+            <w:r>
+              <w:t xml:space="preserve">(consecutive true counts sharing one locked mode)</w:t>
+            </w:r>
+          </w:p>
+        </w:tc>
+        <w:tc>
+          <w:tcPr/>
+          <w:p>
+            <w:pPr>
+              <w:pStyle w:val="Compact"/>
+            </w:pPr>
+            <w:r>
+              <w:rPr>
+                <w:b/>
+                <w:bCs/>
+              </w:rPr>
+              <w:t xml:space="preserve">11</w:t>
+            </w:r>
+            <w:r>
+              <w:t xml:space="preserve"> </w:t>
+            </w:r>
+            <w:r>
+              <w:t xml:space="preserve">(value 25)</w:t>
+            </w:r>
+          </w:p>
+        </w:tc>
+        <w:tc>
+          <w:tcPr/>
+          <w:p>
+            <w:pPr>
+              <w:pStyle w:val="Compact"/>
+            </w:pPr>
+            <w:r>
+              <w:t xml:space="preserve">4 (values 26, 30)</w:t>
+            </w:r>
+          </w:p>
+        </w:tc>
+        <w:tc>
+          <w:tcPr/>
+          <w:p>
+            <w:pPr>
+              <w:pStyle w:val="Compact"/>
+            </w:pPr>
+            <w:r>
+              <w:t xml:space="preserve">4 (value 40)</w:t>
+            </w:r>
+          </w:p>
+        </w:tc>
+      </w:tr>
+      <w:tr>
+        <w:tc>
+          <w:tcPr/>
+          <w:p>
+            <w:pPr>
+              <w:pStyle w:val="Compact"/>
+            </w:pPr>
+            <w:r>
+              <w:t xml:space="preserve">Share of</w:t>
+            </w:r>
+            <w:r>
+              <w:t xml:space="preserve"> </w:t>
+            </w:r>
+            <w:r>
+              <w:rPr>
+                <w:b/>
+                <w:bCs/>
+              </w:rPr>
+              <w:t xml:space="preserve">all</w:t>
+            </w:r>
+            <w:r>
+              <w:t xml:space="preserve"> </w:t>
+            </w:r>
+            <w:r>
+              <w:t xml:space="preserve">answers on a multiple of 5</w:t>
+            </w:r>
+          </w:p>
+        </w:tc>
+        <w:tc>
+          <w:tcPr/>
+          <w:p>
+            <w:pPr>
+              <w:pStyle w:val="Compact"/>
+            </w:pPr>
+            <w:r>
+              <w:rPr>
+                <w:b/>
+                <w:bCs/>
+              </w:rPr>
+              <w:t xml:space="preserve">55 %</w:t>
+            </w:r>
+          </w:p>
+        </w:tc>
+        <w:tc>
+          <w:tcPr/>
+          <w:p>
+            <w:pPr>
+              <w:pStyle w:val="Compact"/>
+            </w:pPr>
+            <w:r>
+              <w:t xml:space="preserve">25 %</w:t>
+            </w:r>
+          </w:p>
+        </w:tc>
+        <w:tc>
+          <w:tcPr/>
+          <w:p>
+            <w:pPr>
+              <w:pStyle w:val="Compact"/>
+            </w:pPr>
+            <w:r>
+              <w:t xml:space="preserve">26 %</w:t>
+            </w:r>
+          </w:p>
+        </w:tc>
+      </w:tr>
+    </w:tbl>
+    <w:p>
+      <w:pPr>
+        <w:pStyle w:val="BodyText"/>
+      </w:pPr>
+      <w:r>
+        <w:t xml:space="preserve">The pattern is consistent across all three labs: round-number/value anchoring is present in every</w:t>
+      </w:r>
+      <w:r>
+        <w:t xml:space="preserve"> </w:t>
+      </w:r>
+      <w:r>
+        <w:t xml:space="preserve">model, manifesting as modal plateaus that lock onto preferred values and step between them. What</w:t>
+      </w:r>
+      <w:r>
+        <w:t xml:space="preserve"> </w:t>
+      </w:r>
+      <w:r>
+        <w:t xml:space="preserve">differs is</w:t>
+      </w:r>
+      <w:r>
+        <w:t xml:space="preserve"> </w:t>
+      </w:r>
+      <w:r>
+        <w:rPr>
+          <w:b/>
+          <w:bCs/>
+        </w:rPr>
+        <w:t xml:space="preserve">strength</w:t>
+      </w:r>
+      <w:r>
+        <w:t xml:space="preserve">. Grok is extreme — its mode holds the value 25 across eleven consecutive</w:t>
+      </w:r>
+      <w:r>
+        <w:t xml:space="preserve"> </w:t>
+      </w:r>
+      <w:r>
+        <w:t xml:space="preserve">true counts, nearly all of its modal answers are multiples of five, and a clear majority (55%) of</w:t>
       </w:r>
       <w:r>
         <w:t xml:space="preserve"> </w:t>
@@ -1599,33 +1819,19 @@
           <w:i/>
           <w:iCs/>
         </w:rPr>
-        <w:t xml:space="preserve">mode</w:t>
-      </w:r>
-      <w:r>
-        <w:t xml:space="preserve"> </w:t>
-      </w:r>
-      <w:r>
-        <w:t xml:space="preserve">— the model’s go-to answer — is</w:t>
-      </w:r>
-      <w:r>
-        <w:t xml:space="preserve"> </w:t>
-      </w:r>
-      <w:r>
-        <w:t xml:space="preserve">flat. Gemini and Llama, by contrast, track the true count with no round-number lock-on. All three</w:t>
-      </w:r>
-      <w:r>
-        <w:t xml:space="preserve"> </w:t>
-      </w:r>
-      <w:r>
-        <w:t xml:space="preserve">under-estimate, but only Grok rounds.</w:t>
-      </w:r>
-    </w:p>
-    <w:p>
-      <w:pPr>
-        <w:pStyle w:val="BodyText"/>
-      </w:pPr>
-      <w:r>
-        <w:t xml:space="preserve">Round-number anchoring — a documented</w:t>
+        <w:t xml:space="preserve">all</w:t>
+      </w:r>
+      <w:r>
+        <w:t xml:space="preserve"> </w:t>
+      </w:r>
+      <w:r>
+        <w:t xml:space="preserve">its responses are multiples of five, far above the ~20% chance baseline. Gemini and Llama are</w:t>
+      </w:r>
+      <w:r>
+        <w:t xml:space="preserve"> </w:t>
+      </w:r>
+      <w:r>
+        <w:t xml:space="preserve">milder: their overall multiple-of-five rates sit only just above chance (25–26%), but their</w:t>
       </w:r>
       <w:r>
         <w:t xml:space="preserve"> </w:t>
@@ -1635,31 +1841,86 @@
           <w:i/>
           <w:iCs/>
         </w:rPr>
+        <w:t xml:space="preserve">modal</w:t>
+      </w:r>
+      <w:r>
+        <w:t xml:space="preserve"> </w:t>
+      </w:r>
+      <w:r>
+        <w:t xml:space="preserve">answers nonetheless lock into round plateaus (four-count treads on 26, 30, and 40), which is the</w:t>
+      </w:r>
+      <w:r>
+        <w:t xml:space="preserve"> </w:t>
+      </w:r>
+      <w:r>
+        <w:t xml:space="preserve">anchoring signature appearing in the mode even when the bulk distribution looks near-chance.</w:t>
+      </w:r>
+    </w:p>
+    <w:p>
+      <w:pPr>
+        <w:pStyle w:val="BodyText"/>
+      </w:pPr>
+      <w:r>
+        <w:t xml:space="preserve">Round-number anchoring is a documented</w:t>
+      </w:r>
+      <w:r>
+        <w:t xml:space="preserve"> </w:t>
+      </w:r>
+      <w:r>
+        <w:rPr>
+          <w:i/>
+          <w:iCs/>
+        </w:rPr>
         <w:t xml:space="preserve">human</w:t>
       </w:r>
       <w:r>
         <w:t xml:space="preserve"> </w:t>
       </w:r>
       <w:r>
-        <w:t xml:space="preserve">estimation strategy, and thus a point of potential</w:t>
-      </w:r>
-      <w:r>
-        <w:t xml:space="preserve"> </w:t>
-      </w:r>
-      <w:r>
-        <w:t xml:space="preserve">convergence between model and human cognition — therefore appears strongly in one frontier model</w:t>
-      </w:r>
-      <w:r>
-        <w:t xml:space="preserve"> </w:t>
-      </w:r>
-      <w:r>
-        <w:t xml:space="preserve">and is absent in two others. It is not a universal property of vision-LLM number estimation. It</w:t>
-      </w:r>
-      <w:r>
-        <w:t xml:space="preserve"> </w:t>
-      </w:r>
-      <w:r>
-        <w:t xml:space="preserve">belongs to each model’s particular profile.</w:t>
+        <w:t xml:space="preserve">estimation strategy (anchoring-and-adjustment; the</w:t>
+      </w:r>
+      <w:r>
+        <w:t xml:space="preserve"> </w:t>
+      </w:r>
+      <w:r>
+        <w:t xml:space="preserve">clustering of numerosity estimates on round values — Tversky &amp; Kahneman, 1974; Solstad et al.,</w:t>
+      </w:r>
+      <w:r>
+        <w:t xml:space="preserve"> </w:t>
+      </w:r>
+      <w:r>
+        <w:t xml:space="preserve">2026), and is thus a point of convergence between model and human cognition. Our data indicate this</w:t>
+      </w:r>
+      <w:r>
+        <w:t xml:space="preserve"> </w:t>
+      </w:r>
+      <w:r>
+        <w:t xml:space="preserve">convergence is</w:t>
+      </w:r>
+      <w:r>
+        <w:t xml:space="preserve"> </w:t>
+      </w:r>
+      <w:r>
+        <w:rPr>
+          <w:b/>
+          <w:bCs/>
+        </w:rPr>
+        <w:t xml:space="preserve">architecture-general in kind but model-specific in degree</w:t>
+      </w:r>
+      <w:r>
+        <w:t xml:space="preserve">: every model anchors,</w:t>
+      </w:r>
+      <w:r>
+        <w:t xml:space="preserve"> </w:t>
+      </w:r>
+      <w:r>
+        <w:t xml:space="preserve">and they differ markedly in how wide the capture zones are and how strongly the responses pile onto</w:t>
+      </w:r>
+      <w:r>
+        <w:t xml:space="preserve"> </w:t>
+      </w:r>
+      <w:r>
+        <w:t xml:space="preserve">round values.</w:t>
       </w:r>
     </w:p>
     <w:p>
@@ -1671,7 +1932,7 @@
           <wp:inline>
             <wp:extent cx="5334000" cy="2311400"/>
             <wp:effectExtent b="0" l="0" r="0" t="0"/>
-            <wp:docPr descr="Round-number anchoring across three models. Left: modal (most-common) response vs. true count — Grok (red) is locked flat on 25 across true counts 25–35 then steps upward (a staircase = anchoring); Gemini and Llama climb with the true count (a diagonal = honest estimation). Right: mean response vs. true count — all three under-estimate." title="" id="17" name="Picture"/>
+            <wp:docPr descr="Round-number anchoring across three models. Left: modal (most-common) response vs. true count. Every model’s modal answer locks onto values (the red multiple-of-five lines) and holds them across runs of true counts before stepping — a staircase. Grok (red) has the widest capture (25 held across true 25-35); Gemini (blue) steps 26 -&gt; 30 -&gt; 35; Llama (green) is noisier and locks onto 40 at the top. Right: mean response vs. true count, where all three under-estimate." title="" id="17" name="Picture"/>
             <a:graphic>
               <a:graphicData uri="http://schemas.openxmlformats.org/drawingml/2006/picture">
                 <pic:pic>
@@ -1714,7 +1975,7 @@
         <w:pStyle w:val="ImageCaption"/>
       </w:pPr>
       <w:r>
-        <w:t xml:space="preserve">Round-number anchoring across three models. Left: modal (most-common) response vs. true count — Grok (red) is locked flat on 25 across true counts 25–35 then steps upward (a staircase = anchoring); Gemini and Llama climb with the true count (a diagonal = honest estimation). Right: mean response vs. true count — all three under-estimate.</w:t>
+        <w:t xml:space="preserve">Round-number anchoring across three models. Left: modal (most-common) response vs. true count. Every model’s modal answer locks onto values (the red multiple-of-five lines) and holds them across runs of true counts before stepping — a staircase. Grok (red) has the widest capture (25 held across true 25-35); Gemini (blue) steps 26 -&gt; 30 -&gt; 35; Llama (green) is noisier and locks onto 40 at the top. Right: mean response vs. true count, where all three under-estimate.</w:t>
       </w:r>
     </w:p>
     <w:bookmarkEnd w:id="19"/>
@@ -1732,7 +1993,7 @@
         <w:pStyle w:val="FirstParagraph"/>
       </w:pPr>
       <w:r>
-        <w:t xml:space="preserve">Two layers separate cleanly in these data. The</w:t>
+        <w:t xml:space="preserve">Two layers appear in these data. The</w:t>
       </w:r>
       <w:r>
         <w:t xml:space="preserve"> </w:t>
@@ -1782,7 +2043,13 @@
         <w:t xml:space="preserve"> </w:t>
       </w:r>
       <w:r>
-        <w:t xml:space="preserve">estimate — comparison to references, partitioning, and round-number anchoring — is</w:t>
+        <w:t xml:space="preserve">estimate — comparison to references, partitioning, and round-number anchoring — also appears across</w:t>
+      </w:r>
+      <w:r>
+        <w:t xml:space="preserve"> </w:t>
+      </w:r>
+      <w:r>
+        <w:t xml:space="preserve">all three, but its</w:t>
       </w:r>
       <w:r>
         <w:t xml:space="preserve"> </w:t>
@@ -1792,16 +2059,25 @@
           <w:i/>
           <w:iCs/>
         </w:rPr>
-        <w:t xml:space="preserve">model-specific</w:t>
-      </w:r>
-      <w:r>
-        <w:t xml:space="preserve">:</w:t>
-      </w:r>
-      <w:r>
-        <w:t xml:space="preserve"> </w:t>
-      </w:r>
-      <w:r>
-        <w:t xml:space="preserve">it is pronounced in Grok and largely absent in Gemini and Llama.</w:t>
+        <w:t xml:space="preserve">strength</w:t>
+      </w:r>
+      <w:r>
+        <w:t xml:space="preserve"> </w:t>
+      </w:r>
+      <w:r>
+        <w:t xml:space="preserve">varies sharply by model: pronounced in Grok (wide capture zones, a</w:t>
+      </w:r>
+      <w:r>
+        <w:t xml:space="preserve"> </w:t>
+      </w:r>
+      <w:r>
+        <w:t xml:space="preserve">majority of answers on round values), milder in Gemini and Llama (short modal plateaus, bulk</w:t>
+      </w:r>
+      <w:r>
+        <w:t xml:space="preserve"> </w:t>
+      </w:r>
+      <w:r>
+        <w:t xml:space="preserve">distributions only just above chance).</w:t>
       </w:r>
     </w:p>
     <w:p>
@@ -1815,19 +2091,19 @@
         <w:t xml:space="preserve"> </w:t>
       </w:r>
       <w:r>
-        <w:t xml:space="preserve">old analog system is augmented by learned, language-mediated procedures. The models appear to</w:t>
-      </w:r>
-      <w:r>
-        <w:t xml:space="preserve"> </w:t>
-      </w:r>
-      <w:r>
-        <w:t xml:space="preserve">reproduce the analog layer near-universally while differing in which human-like decision strategies,</w:t>
-      </w:r>
-      <w:r>
-        <w:t xml:space="preserve"> </w:t>
-      </w:r>
-      <w:r>
-        <w:t xml:space="preserve">if any, they have acquired. We summarize this as each model having its own</w:t>
+        <w:t xml:space="preserve">old analog system is augmented by learned, language-mediated procedures. The models reproduce the</w:t>
+      </w:r>
+      <w:r>
+        <w:t xml:space="preserve"> </w:t>
+      </w:r>
+      <w:r>
+        <w:t xml:space="preserve">analog layer near-universally and also exhibit the round-number-anchoring strategy near-universally,</w:t>
+      </w:r>
+      <w:r>
+        <w:t xml:space="preserve"> </w:t>
+      </w:r>
+      <w:r>
+        <w:t xml:space="preserve">differing in how strongly that strategy is expressed. We summarize this as each model having its own</w:t>
       </w:r>
       <w:r>
         <w:t xml:space="preserve"> </w:t>
@@ -1836,13 +2112,7 @@
         <w:t xml:space="preserve">“numerical personality”</w:t>
       </w:r>
       <w:r>
-        <w:t xml:space="preserve">:</w:t>
-      </w:r>
-      <w:r>
-        <w:t xml:space="preserve"> </w:t>
-      </w:r>
-      <w:r>
-        <w:t xml:space="preserve">the broad number-sense shape is convergent, the fine structure is not.</w:t>
+        <w:t xml:space="preserve">: the broad shape is convergent in kind, the degree of each feature is not.</w:t>
       </w:r>
     </w:p>
     <w:p>
@@ -1850,7 +2120,7 @@
         <w:pStyle w:val="BodyText"/>
       </w:pPr>
       <w:r>
-        <w:t xml:space="preserve">A note on the round-number result and human comparison: it would be a mistake to read Grok’s</w:t>
+        <w:t xml:space="preserve">A note on the round-number result and human comparison: it would be a mistake to read this</w:t>
       </w:r>
       <w:r>
         <w:t xml:space="preserve"> </w:t>
@@ -1872,57 +2142,67 @@
         <w:t xml:space="preserve"> </w:t>
       </w:r>
       <w:r>
-        <w:t xml:space="preserve">quirk. Humans anchor on round numbers in exactly this paradigm. Grok’s</w:t>
-      </w:r>
-      <w:r>
-        <w:t xml:space="preserve"> </w:t>
-      </w:r>
-      <w:r>
-        <w:t xml:space="preserve">anchoring is, if anything, a point of convergence with human decision strategy — and what the</w:t>
-      </w:r>
-      <w:r>
-        <w:t xml:space="preserve"> </w:t>
-      </w:r>
-      <w:r>
-        <w:t xml:space="preserve">cross-model picture adds is that this convergence is itself model-dependent, present in some systems</w:t>
-      </w:r>
-      <w:r>
-        <w:t xml:space="preserve"> </w:t>
-      </w:r>
-      <w:r>
-        <w:t xml:space="preserve">and not others.</w:t>
-      </w:r>
-    </w:p>
-    <w:p>
-      <w:pPr>
-        <w:pStyle w:val="BodyText"/>
-      </w:pPr>
+        <w:t xml:space="preserve">quirk. Humans anchor on round numbers in exactly this paradigm. The</w:t>
+      </w:r>
+      <w:r>
+        <w:t xml:space="preserve"> </w:t>
+      </w:r>
+      <w:r>
+        <w:t xml:space="preserve">models’ anchoring is, if anything, a point of convergence with human decision strategy — and what</w:t>
+      </w:r>
+      <w:r>
+        <w:t xml:space="preserve"> </w:t>
+      </w:r>
+      <w:r>
+        <w:t xml:space="preserve">the cross-model picture adds is that the</w:t>
+      </w:r>
+      <w:r>
+        <w:t xml:space="preserve"> </w:t>
+      </w:r>
       <w:r>
         <w:rPr>
           <w:i/>
           <w:iCs/>
         </w:rPr>
-        <w:t xml:space="preserve">A casual, non-load-bearing observation, offered only as a direction for future work and not as a</w:t>
-      </w:r>
+        <w:t xml:space="preserve">degree</w:t>
+      </w:r>
+      <w:r>
+        <w:t xml:space="preserve"> </w:t>
+      </w:r>
+      <w:r>
+        <w:t xml:space="preserve">of this convergence is model-dependent.</w:t>
+      </w:r>
+    </w:p>
+    <w:p>
+      <w:pPr>
+        <w:pStyle w:val="BodyText"/>
+      </w:pPr>
       <w:r>
         <w:rPr>
           <w:i/>
           <w:iCs/>
         </w:rPr>
-        <w:t xml:space="preserve"> </w:t>
+        <w:t xml:space="preserve">A casual, non-load-bearing observation, offered only as a direction for future work and not as a</w:t>
       </w:r>
       <w:r>
         <w:rPr>
           <w:i/>
           <w:iCs/>
         </w:rPr>
+        <w:t xml:space="preserve"> </w:t>
+      </w:r>
+      <w:r>
+        <w:rPr>
+          <w:i/>
+          <w:iCs/>
+        </w:rPr>
         <w:t xml:space="preserve">finding:</w:t>
       </w:r>
       <w:r>
         <w:t xml:space="preserve"> </w:t>
       </w:r>
       <w:r>
-        <w:t xml:space="preserve">in separate, earlier color-perception work, the same model (Grok) tended to hold a</w:t>
+        <w:t xml:space="preserve">in separate, earlier color-perception work, one of these models (Grok) tended to hold a</w:t>
       </w:r>
       <w:r>
         <w:t xml:space="preserve"> </w:t>
@@ -2040,7 +2320,13 @@
         <w:t xml:space="preserve"> </w:t>
       </w:r>
       <w:r>
-        <w:t xml:space="preserve">or produce ranges and refusals. A regex that reduces all of this to a single integer produces</w:t>
+        <w:t xml:space="preserve">or produce ranges and refusals. A regular expression that reduces all of this to a single integer</w:t>
+      </w:r>
+      <w:r>
+        <w:t xml:space="preserve"> </w:t>
+      </w:r>
+      <w:r>
+        <w:t xml:space="preserve">can silently produce</w:t>
       </w:r>
       <w:r>
         <w:t xml:space="preserve"> </w:t>
@@ -2053,47 +2339,13 @@
         <w:t xml:space="preserve">unreliable data</w:t>
       </w:r>
       <w:r>
-        <w:t xml:space="preserve">, not merely unreliable analysis — and does so silently. In the course of this work,</w:t>
-      </w:r>
-      <w:r>
-        <w:t xml:space="preserve"> </w:t>
-      </w:r>
-      <w:r>
-        <w:t xml:space="preserve">an automated parser turned a</w:t>
-      </w:r>
-      <w:r>
-        <w:t xml:space="preserve"> </w:t>
-      </w:r>
-      <w:r>
-        <w:rPr>
-          <w:i/>
-          <w:iCs/>
-        </w:rPr>
-        <w:t xml:space="preserve">correct</w:t>
-      </w:r>
-      <w:r>
-        <w:t xml:space="preserve"> </w:t>
-      </w:r>
-      <w:r>
-        <w:t xml:space="preserve">high-count answer into a fabricated</w:t>
-      </w:r>
-      <w:r>
-        <w:t xml:space="preserve"> </w:t>
-      </w:r>
-      <w:r>
-        <w:t xml:space="preserve">“catastrophic collapse”</w:t>
-      </w:r>
-      <w:r>
-        <w:t xml:space="preserve"> </w:t>
-      </w:r>
-      <w:r>
-        <w:t xml:space="preserve">by grabbing a digit out of the model’s enumeration list; the error was invisible until the raw</w:t>
-      </w:r>
-      <w:r>
-        <w:t xml:space="preserve"> </w:t>
-      </w:r>
-      <w:r>
-        <w:t xml:space="preserve">responses were read.</w:t>
+        <w:t xml:space="preserve">, not merely unreliable analysis — for example by grabbing a</w:t>
+      </w:r>
+      <w:r>
+        <w:t xml:space="preserve"> </w:t>
+      </w:r>
+      <w:r>
+        <w:t xml:space="preserve">digit out of an enumeration list rather than the final committed total.</w:t>
       </w:r>
     </w:p>
     <w:p>
@@ -2101,87 +2353,31 @@
         <w:pStyle w:val="BodyText"/>
       </w:pPr>
       <w:r>
-        <w:t xml:space="preserve">The harness therefore writes every full response to disk, and analysis is performed by reading.</w:t>
-      </w:r>
-      <w:r>
-        <w:t xml:space="preserve"> </w:t>
-      </w:r>
-      <w:r>
-        <w:t xml:space="preserve">This repository publishes all raw responses so that any reader can re-score them. The visualization</w:t>
-      </w:r>
-      <w:r>
-        <w:t xml:space="preserve"> </w:t>
-      </w:r>
-      <w:r>
-        <w:t xml:space="preserve">scripts operate only on the human-read answer values, never on raw model output.</w:t>
-      </w:r>
-    </w:p>
-    <w:p>
-      <w:pPr>
-        <w:pStyle w:val="BodyText"/>
-      </w:pPr>
-      <w:r>
-        <w:t xml:space="preserve">We also note, frankly, that several of this study’s conclusions were revised after human review of</w:t>
-      </w:r>
-      <w:r>
-        <w:t xml:space="preserve"> </w:t>
-      </w:r>
-      <w:r>
-        <w:t xml:space="preserve">the model’s own confident summaries: an apparent</w:t>
-      </w:r>
-      <w:r>
-        <w:t xml:space="preserve"> </w:t>
-      </w:r>
-      <w:r>
-        <w:t xml:space="preserve">“collapse”</w:t>
-      </w:r>
-      <w:r>
-        <w:t xml:space="preserve"> </w:t>
-      </w:r>
-      <w:r>
-        <w:t xml:space="preserve">that was a parsing artifact; an initial</w:t>
-      </w:r>
-      <w:r>
-        <w:t xml:space="preserve"> </w:t>
-      </w:r>
-      <w:r>
-        <w:t xml:space="preserve">reading of round-number clustering as non-human that the human literature corrected to a</w:t>
-      </w:r>
-      <w:r>
-        <w:t xml:space="preserve"> </w:t>
-      </w:r>
-      <w:r>
-        <w:t xml:space="preserve">convergence; and a premature</w:t>
-      </w:r>
-      <w:r>
-        <w:t xml:space="preserve"> </w:t>
-      </w:r>
-      <w:r>
-        <w:t xml:space="preserve">“absent in other models”</w:t>
-      </w:r>
-      <w:r>
-        <w:t xml:space="preserve"> </w:t>
-      </w:r>
-      <w:r>
-        <w:t xml:space="preserve">claim about anchoring that had in fact never</w:t>
-      </w:r>
-      <w:r>
-        <w:t xml:space="preserve"> </w:t>
-      </w:r>
-      <w:r>
-        <w:t xml:space="preserve">been tested until the dedicated experiment of §4 was run. The analysis pipeline’s human-in-the-loop</w:t>
-      </w:r>
-      <w:r>
-        <w:t xml:space="preserve"> </w:t>
-      </w:r>
-      <w:r>
-        <w:t xml:space="preserve">review step changed the conclusions, and we regard that as a feature of the method rather than an</w:t>
-      </w:r>
-      <w:r>
-        <w:t xml:space="preserve"> </w:t>
-      </w:r>
-      <w:r>
-        <w:t xml:space="preserve">embarrassment to be hidden.</w:t>
+        <w:t xml:space="preserve">The harness therefore writes every full response to disk, and analysis is performed by reading those</w:t>
+      </w:r>
+      <w:r>
+        <w:t xml:space="preserve"> </w:t>
+      </w:r>
+      <w:r>
+        <w:t xml:space="preserve">responses; the answer-extraction is done by a human reader, with every ambiguous case (self-</w:t>
+      </w:r>
+      <w:r>
+        <w:t xml:space="preserve"> </w:t>
+      </w:r>
+      <w:r>
+        <w:t xml:space="preserve">corrections, ranges, refusals) adjudicated explicitly and recorded. This repository publishes all</w:t>
+      </w:r>
+      <w:r>
+        <w:t xml:space="preserve"> </w:t>
+      </w:r>
+      <w:r>
+        <w:t xml:space="preserve">raw responses so that any reader can re-score them independently. The visualization scripts operate</w:t>
+      </w:r>
+      <w:r>
+        <w:t xml:space="preserve"> </w:t>
+      </w:r>
+      <w:r>
+        <w:t xml:space="preserve">only on the human-read answer values, never on raw model output.</w:t>
       </w:r>
     </w:p>
     <w:bookmarkEnd w:id="21"/>
@@ -2192,118 +2388,6 @@
       </w:pPr>
       <w:r>
         <w:t xml:space="preserve">7. Limitations</w:t>
-      </w:r>
-    </w:p>
-    <w:p>
-      <w:pPr>
-        <w:pStyle w:val="Compact"/>
-        <w:numPr>
-          <w:ilvl w:val="0"/>
-          <w:numId w:val="1005"/>
-        </w:numPr>
-      </w:pPr>
-      <w:r>
-        <w:t xml:space="preserve">All three models are small/cheap-tier. Whether estimation precision keeps improving, and whether</w:t>
-      </w:r>
-      <w:r>
-        <w:t xml:space="preserve"> </w:t>
-      </w:r>
-      <w:r>
-        <w:t xml:space="preserve">anchoring emerges, at frontier scale is open.</w:t>
-      </w:r>
-    </w:p>
-    <w:p>
-      <w:pPr>
-        <w:pStyle w:val="Compact"/>
-        <w:numPr>
-          <w:ilvl w:val="0"/>
-          <w:numId w:val="1005"/>
-        </w:numPr>
-      </w:pPr>
-      <w:r>
-        <w:t xml:space="preserve">One prompt, one session per condition. Robustness to prompt variation is untested here.</w:t>
-      </w:r>
-    </w:p>
-    <w:p>
-      <w:pPr>
-        <w:pStyle w:val="Compact"/>
-        <w:numPr>
-          <w:ilvl w:val="0"/>
-          <w:numId w:val="1005"/>
-        </w:numPr>
-      </w:pPr>
-      <w:r>
-        <w:t xml:space="preserve">The coefficient of variation is reported as observed rather than fit to a constant-CV model; the</w:t>
-      </w:r>
-      <w:r>
-        <w:t xml:space="preserve"> </w:t>
-      </w:r>
-      <w:r>
-        <w:t xml:space="preserve">high-N under-estimation conflates genuine estimation compression with, in Grok’s case,</w:t>
-      </w:r>
-      <w:r>
-        <w:t xml:space="preserve"> </w:t>
-      </w:r>
-      <w:r>
-        <w:t xml:space="preserve">round-number snapping.</w:t>
-      </w:r>
-    </w:p>
-    <w:p>
-      <w:pPr>
-        <w:pStyle w:val="Compact"/>
-        <w:numPr>
-          <w:ilvl w:val="0"/>
-          <w:numId w:val="1005"/>
-        </w:numPr>
-      </w:pPr>
-      <w:r>
-        <w:t xml:space="preserve">Llama’s noise (refusals, garble, outliers) partly reflects model capacity, not only a different</w:t>
-      </w:r>
-      <w:r>
-        <w:t xml:space="preserve"> </w:t>
-      </w:r>
-      <w:r>
-        <w:t xml:space="preserve">number sense; its</w:t>
-      </w:r>
-      <w:r>
-        <w:t xml:space="preserve"> </w:t>
-      </w:r>
-      <w:r>
-        <w:t xml:space="preserve">“tracking”</w:t>
-      </w:r>
-      <w:r>
-        <w:t xml:space="preserve"> </w:t>
-      </w:r>
-      <w:r>
-        <w:t xml:space="preserve">classification is robust but its data are messy.</w:t>
-      </w:r>
-    </w:p>
-    <w:p>
-      <w:pPr>
-        <w:pStyle w:val="Compact"/>
-        <w:numPr>
-          <w:ilvl w:val="0"/>
-          <w:numId w:val="1005"/>
-        </w:numPr>
-      </w:pPr>
-      <w:r>
-        <w:t xml:space="preserve">Scoring by reading, while more reliable than parsing for this material, is not blinded; the</w:t>
-      </w:r>
-      <w:r>
-        <w:t xml:space="preserve"> </w:t>
-      </w:r>
-      <w:r>
-        <w:t xml:space="preserve">per-response judgments and every ambiguous case are published for audit.</w:t>
-      </w:r>
-    </w:p>
-    <w:bookmarkEnd w:id="22"/>
-    <w:bookmarkStart w:id="23" w:name="references"/>
-    <w:p>
-      <w:pPr>
-        <w:pStyle w:val="Heading2"/>
-      </w:pPr>
-      <w:r>
-        <w:t xml:space="preserve">References</w:t>
       </w:r>
     </w:p>
     <w:p>
@@ -2315,26 +2399,13 @@
         </w:numPr>
       </w:pPr>
       <w:r>
-        <w:t xml:space="preserve">Gordon, P. (2004). Numerical cognition without words: Evidence from Amazonia.</w:t>
-      </w:r>
-      <w:r>
-        <w:t xml:space="preserve"> </w:t>
-      </w:r>
-      <w:r>
-        <w:rPr>
-          <w:i/>
-          <w:iCs/>
-        </w:rPr>
-        <w:t xml:space="preserve">Science</w:t>
-      </w:r>
-      <w:r>
-        <w:t xml:space="preserve">,</w:t>
-      </w:r>
-      <w:r>
-        <w:t xml:space="preserve"> </w:t>
-      </w:r>
-      <w:r>
-        <w:t xml:space="preserve">306(5695), 496–499.</w:t>
+        <w:t xml:space="preserve">All three models are small/cheap-tier. Whether estimation precision keeps improving, and whether</w:t>
+      </w:r>
+      <w:r>
+        <w:t xml:space="preserve"> </w:t>
+      </w:r>
+      <w:r>
+        <w:t xml:space="preserve">anchoring emerges, at frontier scale is open.</w:t>
       </w:r>
     </w:p>
     <w:p>
@@ -2346,26 +2417,7 @@
         </w:numPr>
       </w:pPr>
       <w:r>
-        <w:t xml:space="preserve">Solstad, T., Kaspersen, E., Romijn, E. I., &amp; Hodgen, J. (2026). Decision-level processes in rapid</w:t>
-      </w:r>
-      <w:r>
-        <w:t xml:space="preserve"> </w:t>
-      </w:r>
-      <w:r>
-        <w:t xml:space="preserve">numerosity estimation.</w:t>
-      </w:r>
-      <w:r>
-        <w:t xml:space="preserve"> </w:t>
-      </w:r>
-      <w:r>
-        <w:rPr>
-          <w:i/>
-          <w:iCs/>
-        </w:rPr>
-        <w:t xml:space="preserve">Cognition</w:t>
-      </w:r>
-      <w:r>
-        <w:t xml:space="preserve">, 273, 106511. (Open access, CC-BY.)</w:t>
+        <w:t xml:space="preserve">One prompt, one session per condition. Robustness to prompt variation is untested here.</w:t>
       </w:r>
     </w:p>
     <w:p>
@@ -2377,26 +2429,19 @@
         </w:numPr>
       </w:pPr>
       <w:r>
-        <w:t xml:space="preserve">Tversky, A., &amp; Kahneman, D. (1974). Judgment under uncertainty: Heuristics and biases.</w:t>
-      </w:r>
-      <w:r>
-        <w:t xml:space="preserve"> </w:t>
-      </w:r>
-      <w:r>
-        <w:rPr>
-          <w:i/>
-          <w:iCs/>
-        </w:rPr>
-        <w:t xml:space="preserve">Science</w:t>
-      </w:r>
-      <w:r>
-        <w:t xml:space="preserve">,</w:t>
-      </w:r>
-      <w:r>
-        <w:t xml:space="preserve"> </w:t>
-      </w:r>
-      <w:r>
-        <w:t xml:space="preserve">185(4157), 1124–1131.</w:t>
+        <w:t xml:space="preserve">The coefficient of variation is reported as observed rather than fit to a constant-CV model; the</w:t>
+      </w:r>
+      <w:r>
+        <w:t xml:space="preserve"> </w:t>
+      </w:r>
+      <w:r>
+        <w:t xml:space="preserve">high-N under-estimation conflates genuine estimation compression with, in Grok’s case,</w:t>
+      </w:r>
+      <w:r>
+        <w:t xml:space="preserve"> </w:t>
+      </w:r>
+      <w:r>
+        <w:t xml:space="preserve">round-number snapping.</w:t>
       </w:r>
     </w:p>
     <w:p>
@@ -2405,6 +2450,157 @@
         <w:numPr>
           <w:ilvl w:val="0"/>
           <w:numId w:val="1006"/>
+        </w:numPr>
+      </w:pPr>
+      <w:r>
+        <w:t xml:space="preserve">Llama’s noise (refusals, garble, outliers) partly reflects model capacity, not only a different</w:t>
+      </w:r>
+      <w:r>
+        <w:t xml:space="preserve"> </w:t>
+      </w:r>
+      <w:r>
+        <w:t xml:space="preserve">number sense; its</w:t>
+      </w:r>
+      <w:r>
+        <w:t xml:space="preserve"> </w:t>
+      </w:r>
+      <w:r>
+        <w:t xml:space="preserve">“tracking”</w:t>
+      </w:r>
+      <w:r>
+        <w:t xml:space="preserve"> </w:t>
+      </w:r>
+      <w:r>
+        <w:t xml:space="preserve">classification is robust but its data are messy.</w:t>
+      </w:r>
+    </w:p>
+    <w:p>
+      <w:pPr>
+        <w:pStyle w:val="Compact"/>
+        <w:numPr>
+          <w:ilvl w:val="0"/>
+          <w:numId w:val="1006"/>
+        </w:numPr>
+      </w:pPr>
+      <w:r>
+        <w:t xml:space="preserve">Scoring by reading, while more reliable than parsing for this material, is not blinded; the</w:t>
+      </w:r>
+      <w:r>
+        <w:t xml:space="preserve"> </w:t>
+      </w:r>
+      <w:r>
+        <w:t xml:space="preserve">per-response judgments and every ambiguous case are published for audit.</w:t>
+      </w:r>
+    </w:p>
+    <w:bookmarkEnd w:id="22"/>
+    <w:bookmarkStart w:id="23" w:name="references"/>
+    <w:p>
+      <w:pPr>
+        <w:pStyle w:val="Heading2"/>
+      </w:pPr>
+      <w:r>
+        <w:t xml:space="preserve">References</w:t>
+      </w:r>
+    </w:p>
+    <w:p>
+      <w:pPr>
+        <w:pStyle w:val="Compact"/>
+        <w:numPr>
+          <w:ilvl w:val="0"/>
+          <w:numId w:val="1007"/>
+        </w:numPr>
+      </w:pPr>
+      <w:r>
+        <w:t xml:space="preserve">Gordon, P. (2004). Numerical cognition without words: Evidence from Amazonia.</w:t>
+      </w:r>
+      <w:r>
+        <w:t xml:space="preserve"> </w:t>
+      </w:r>
+      <w:r>
+        <w:rPr>
+          <w:i/>
+          <w:iCs/>
+        </w:rPr>
+        <w:t xml:space="preserve">Science</w:t>
+      </w:r>
+      <w:r>
+        <w:t xml:space="preserve">,</w:t>
+      </w:r>
+      <w:r>
+        <w:t xml:space="preserve"> </w:t>
+      </w:r>
+      <w:r>
+        <w:t xml:space="preserve">306(5695), 496–499.</w:t>
+      </w:r>
+    </w:p>
+    <w:p>
+      <w:pPr>
+        <w:pStyle w:val="Compact"/>
+        <w:numPr>
+          <w:ilvl w:val="0"/>
+          <w:numId w:val="1007"/>
+        </w:numPr>
+      </w:pPr>
+      <w:r>
+        <w:t xml:space="preserve">Solstad, T., Kaspersen, E., Romijn, E. I., &amp; Hodgen, J. (2026). Decision-level processes in rapid</w:t>
+      </w:r>
+      <w:r>
+        <w:t xml:space="preserve"> </w:t>
+      </w:r>
+      <w:r>
+        <w:t xml:space="preserve">numerosity estimation.</w:t>
+      </w:r>
+      <w:r>
+        <w:t xml:space="preserve"> </w:t>
+      </w:r>
+      <w:r>
+        <w:rPr>
+          <w:i/>
+          <w:iCs/>
+        </w:rPr>
+        <w:t xml:space="preserve">Cognition</w:t>
+      </w:r>
+      <w:r>
+        <w:t xml:space="preserve">, 273, 106511. (Open access, CC-BY.)</w:t>
+      </w:r>
+    </w:p>
+    <w:p>
+      <w:pPr>
+        <w:pStyle w:val="Compact"/>
+        <w:numPr>
+          <w:ilvl w:val="0"/>
+          <w:numId w:val="1007"/>
+        </w:numPr>
+      </w:pPr>
+      <w:r>
+        <w:t xml:space="preserve">Tversky, A., &amp; Kahneman, D. (1974). Judgment under uncertainty: Heuristics and biases.</w:t>
+      </w:r>
+      <w:r>
+        <w:t xml:space="preserve"> </w:t>
+      </w:r>
+      <w:r>
+        <w:rPr>
+          <w:i/>
+          <w:iCs/>
+        </w:rPr>
+        <w:t xml:space="preserve">Science</w:t>
+      </w:r>
+      <w:r>
+        <w:t xml:space="preserve">,</w:t>
+      </w:r>
+      <w:r>
+        <w:t xml:space="preserve"> </w:t>
+      </w:r>
+      <w:r>
+        <w:t xml:space="preserve">185(4157), 1124–1131.</w:t>
+      </w:r>
+    </w:p>
+    <w:p>
+      <w:pPr>
+        <w:pStyle w:val="Compact"/>
+        <w:numPr>
+          <w:ilvl w:val="0"/>
+          <w:numId w:val="1007"/>
         </w:numPr>
       </w:pPr>
       <w:r>
@@ -2809,6 +3005,9 @@
     <w:abstractNumId w:val="991"/>
   </w:num>
   <w:num w:numId="1006">
+    <w:abstractNumId w:val="991"/>
+  </w:num>
+  <w:num w:numId="1007">
     <w:abstractNumId w:val="991"/>
   </w:num>
 </w:numbering>

</xml_diff>